<commit_message>
feat(work): fuller stacks from the repos, AWS as one chip with its mark
Surveyed the repos: cabeazy adds NATS, Expo, Jetpack Compose, Mapbox,
Sentry, Docker, Railway, Maestro; GPFlow adds MongoDB and Vitest;
whenwillyoumarry runs on Railway with Cloudflare R2, Drizzle, Redis,
Stripe and Sweego, not AWS (site and CV corrected). Betmate's AWS services
collapse into one AWS chip with the CC0 AWS mark. C# loses a wrong mark:
simple-icons' siSharp is the sharp image library.

Co-Authored-By: Claude Opus 5.5 <noreply@anthropic.com>
</commit_message>
<xml_diff>
--- a/public/assets/abel_ghebrezadik_cv.docx
+++ b/public/assets/abel_ghebrezadik_cv.docx
@@ -1410,7 +1410,7 @@
           <w:rFonts w:ascii="Arial" w:hAnsi="Arial"/>
           <w:sz w:val="18"/>
         </w:rPr>
-        <w:t>Go API on PostgreSQL and Redis with a contract-first OpenAPI /v2, Stripe payments, WebSockets and a retry-safe job queue; React Native passenger and driver apps, a native Kotlin Android app under way, and a Next.js site and operator portal.</w:t>
+        <w:t>Go API on PostgreSQL, Redis and NATS with a contract-first OpenAPI /v2, Stripe payments, WebSockets and a retry-safe job queue; React Native passenger and driver apps, a native Kotlin Android app under way, and a Next.js site and operator portal.</w:t>
       </w:r>
     </w:p>
     <w:p>
@@ -1460,7 +1460,7 @@
           <w:rFonts w:ascii="Arial" w:hAnsi="Arial"/>
           <w:sz w:val="18"/>
         </w:rPr>
-        <w:t>Wedding website builder with templates, a live-preview editor, RSVPs, a drag-and-drop seating chart and email and SMS broadcasts. TypeScript, Next.js, PostgreSQL, AWS.</w:t>
+        <w:t>Wedding website builder with templates, a live-preview editor, RSVPs, a drag-and-drop seating chart and email and SMS broadcasts. TypeScript, Next.js, PostgreSQL with Drizzle, Redis, Stripe, Cloudflare R2, on Railway.</w:t>
       </w:r>
     </w:p>
     <w:p>

</xml_diff>

<commit_message>
feat(content): Arena's Angular rebuild, Bedrock AI chat and 250 pages of docs
On the site's Arena entry (detail and stack: Angular, AWS Bedrock) and in
both CV files (two new bullets, Angular and Bedrock in skills and profile).
Facts as given by Abel, 1 Oct 2026.

Co-Authored-By: Claude Opus 5.5 <noreply@anthropic.com>
</commit_message>
<xml_diff>
--- a/public/assets/abel_ghebrezadik_cv.docx
+++ b/public/assets/abel_ghebrezadik_cv.docx
@@ -101,7 +101,7 @@
       </w:pPr>
       <w:r>
         <w:rPr/>
-        <w:t>Lead / Senior Software Engineer with 10 years' experience building backend systems and products across finance, property, health and gambling. Specialist in C# and .NET on AWS serverless (Lambda, API Gateway, SNS/SQS), with TypeScript, React and Next.js on the front end. Led the backend of a £500k-jackpot multiplayer game inside the William Hill app that scaled to 1 million users, and was technical lead on a project that saved SalaryFinance millions in fines. Leads greenfield builds, clears legacy tech debt and mentors engineers, in permanent and contract roles. BSc Mathematics, University of Southampton.</w:t>
+        <w:t>Lead / Senior Software Engineer with 10 years' experience building backend systems and products across finance, property, health and gambling. Specialist in C# and .NET on AWS serverless (Lambda, API Gateway, SNS/SQS), with TypeScript, React, Angular and Next.js on the front end, and AI features on AWS Bedrock. Led the backend of a £500k-jackpot multiplayer game inside the William Hill app that scaled to 1 million users, and was technical lead on a project that saved SalaryFinance millions in fines. Leads greenfield builds, clears legacy tech debt and mentors engineers, in permanent and contract roles. BSc Mathematics, University of Southampton.</w:t>
       </w:r>
     </w:p>
     <w:p>
@@ -159,7 +159,7 @@
       </w:r>
       <w:r>
         <w:rPr/>
-        <w:t>React, Next.js, Vue.js, Blazor, Tailwind CSS, React Native, Expo, Kotlin (Android), Flutter</w:t>
+        <w:t>React, Angular, Next.js, Vue.js, Blazor, Tailwind CSS, React Native, Expo, Kotlin (Android), Flutter</w:t>
       </w:r>
     </w:p>
     <w:p>
@@ -175,7 +175,7 @@
       </w:r>
       <w:r>
         <w:rPr/>
-        <w:t>AWS (Lambda, API Gateway, SNS, SQS, CloudFormation), serverless, Azure, Docker, Terraform, GitHub Actions, CI/CD, Railway, Vercel, Cloudflare</w:t>
+        <w:t>AWS (Lambda, Bedrock, API Gateway, SNS, SQS, CloudFormation), serverless, Azure, Docker, Terraform, GitHub Actions, CI/CD, Railway, Vercel, Cloudflare</w:t>
       </w:r>
     </w:p>
     <w:p>
@@ -288,7 +288,59 @@
       </w:r>
       <w:r>
         <w:rPr/>
-        <w:t>C#, .NET, TypeScript, React, Snowflake, MySQL, Redis, Kafka, gRPC, AWS Lambda</w:t>
+        <w:t>C#, .NET, TypeScript, Angular, React, AWS Bedrock, AWS Lambda, Snowflake, MySQL, Redis, Kafka, gRPC</w:t>
+      </w:r>
+    </w:p>
+    <w:p>
+      <w:pPr>
+        <w:pStyle w:val="ListParagraph"/>
+        <w:numPr>
+          <w:ilvl w:val="0"/>
+          <w:numId w:val="1"/>
+        </w:numPr>
+        <w:tabs>
+          <w:tab w:val="left" w:leader="none" w:pos="114"/>
+        </w:tabs>
+        <w:spacing w:before="28" w:after="20" w:line="240" w:lineRule="auto"/>
+        <w:ind w:left="114" w:right="0" w:hanging="114"/>
+        <w:jc w:val="left"/>
+        <w:rPr>
+          <w:sz w:val="18"/>
+          <w:szCs w:val="18"/>
+        </w:rPr>
+      </w:pPr>
+      <w:r>
+        <w:rPr>
+          <w:rFonts w:ascii="Arial" w:hAnsi="Arial"/>
+          <w:sz w:val="18"/>
+        </w:rPr>
+        <w:t>Rebuilt a five-year-old Angular frontend into a modern UI based on Cloudflare's designs, with standardised patterns and strict adherence to frontend principles.</w:t>
+      </w:r>
+    </w:p>
+    <w:p>
+      <w:pPr>
+        <w:pStyle w:val="ListParagraph"/>
+        <w:numPr>
+          <w:ilvl w:val="0"/>
+          <w:numId w:val="1"/>
+        </w:numPr>
+        <w:tabs>
+          <w:tab w:val="left" w:leader="none" w:pos="114"/>
+        </w:tabs>
+        <w:spacing w:before="28" w:after="20" w:line="240" w:lineRule="auto"/>
+        <w:ind w:left="114" w:right="0" w:hanging="114"/>
+        <w:jc w:val="left"/>
+        <w:rPr>
+          <w:sz w:val="18"/>
+          <w:szCs w:val="18"/>
+        </w:rPr>
+      </w:pPr>
+      <w:r>
+        <w:rPr>
+          <w:rFonts w:ascii="Arial" w:hAnsi="Arial"/>
+          <w:sz w:val="18"/>
+        </w:rPr>
+        <w:t>Built an AI chat assistant on AWS Bedrock and wrote 250 pages of in-app documentation to triage customer-ops questions, with how-to guides and permissions and access guidance.</w:t>
       </w:r>
     </w:p>
     <w:p>

</xml_diff>

<commit_message>
fix(content): Arena latency and new Arena work (#3)
Average API latency 14s to 2s; Angular rebuild based on Cloudflare's designs; AWS Bedrock AI chat; 250 pages of in-app docs. Site and both CV files.

Co-Authored-By: Claude Opus 5.5 <noreply@anthropic.com>
</commit_message>
<xml_diff>
--- a/public/assets/abel_ghebrezadik_cv.docx
+++ b/public/assets/abel_ghebrezadik_cv.docx
@@ -101,7 +101,7 @@
       </w:pPr>
       <w:r>
         <w:rPr/>
-        <w:t>Lead / Senior Software Engineer with 10 years' experience building backend systems and products across finance, property, health and gambling. Specialist in C# and .NET on AWS serverless (Lambda, API Gateway, SNS/SQS), with TypeScript, React and Next.js on the front end. Led the backend of a £500k-jackpot multiplayer game inside the William Hill app that scaled to 1 million users, and was technical lead on a project that saved SalaryFinance millions in fines. Leads greenfield builds, clears legacy tech debt and mentors engineers, in permanent and contract roles. BSc Mathematics, University of Southampton.</w:t>
+        <w:t>Lead / Senior Software Engineer with 10 years' experience building backend systems and products across finance, property, health and gambling. Specialist in C# and .NET on AWS serverless (Lambda, API Gateway, SNS/SQS), with TypeScript, React, Angular and Next.js on the front end, and AI features on AWS Bedrock. Led the backend of a £500k-jackpot multiplayer game inside the William Hill app that scaled to 1 million users, and was technical lead on a project that saved SalaryFinance millions in fines. Leads greenfield builds, clears legacy tech debt and mentors engineers, in permanent and contract roles. BSc Mathematics, University of Southampton.</w:t>
       </w:r>
     </w:p>
     <w:p>
@@ -159,7 +159,7 @@
       </w:r>
       <w:r>
         <w:rPr/>
-        <w:t>React, Next.js, Vue.js, Blazor, Tailwind CSS, React Native, Expo, Kotlin (Android), Flutter</w:t>
+        <w:t>React, Angular, Next.js, Vue.js, Blazor, Tailwind CSS, React Native, Expo, Kotlin (Android), Flutter</w:t>
       </w:r>
     </w:p>
     <w:p>
@@ -175,7 +175,7 @@
       </w:r>
       <w:r>
         <w:rPr/>
-        <w:t>AWS (Lambda, API Gateway, SNS, SQS, CloudFormation), serverless, Azure, Docker, Terraform, GitHub Actions, CI/CD, Railway, Vercel, Cloudflare</w:t>
+        <w:t>AWS (Lambda, Bedrock, API Gateway, SNS, SQS, CloudFormation), serverless, Azure, Docker, Terraform, GitHub Actions, CI/CD, Railway, Vercel, Cloudflare</w:t>
       </w:r>
     </w:p>
     <w:p>
@@ -288,33 +288,85 @@
       </w:r>
       <w:r>
         <w:rPr/>
-        <w:t>C#, .NET, TypeScript, React, Snowflake, MySQL, Redis, Kafka, gRPC, AWS Lambda</w:t>
-      </w:r>
-    </w:p>
-    <w:p>
-      <w:pPr>
-        <w:pStyle w:val="ListParagraph"/>
-        <w:numPr>
-          <w:ilvl w:val="0"/>
-          <w:numId w:val="1"/>
-        </w:numPr>
-        <w:tabs>
-          <w:tab w:val="left" w:leader="none" w:pos="114"/>
-        </w:tabs>
-        <w:spacing w:before="28" w:after="20" w:line="240" w:lineRule="auto"/>
-        <w:ind w:left="114" w:right="0" w:hanging="114"/>
-        <w:jc w:val="left"/>
-        <w:rPr>
-          <w:sz w:val="18"/>
-          <w:szCs w:val="18"/>
-        </w:rPr>
-      </w:pPr>
-      <w:r>
-        <w:rPr>
-          <w:rFonts w:ascii="Arial" w:hAnsi="Arial"/>
-          <w:sz w:val="18"/>
-        </w:rPr>
-        <w:t>Cut API latency by up to 8s with Lambda warm-up pings and provisioned concurrency to remove cold starts (94% hit rate).</w:t>
+        <w:t>C#, .NET, TypeScript, Angular, React, AWS Bedrock, AWS Lambda, Snowflake, MySQL, Redis, Kafka, gRPC</w:t>
+      </w:r>
+    </w:p>
+    <w:p>
+      <w:pPr>
+        <w:pStyle w:val="ListParagraph"/>
+        <w:numPr>
+          <w:ilvl w:val="0"/>
+          <w:numId w:val="1"/>
+        </w:numPr>
+        <w:tabs>
+          <w:tab w:val="left" w:leader="none" w:pos="114"/>
+        </w:tabs>
+        <w:spacing w:before="28" w:after="20" w:line="240" w:lineRule="auto"/>
+        <w:ind w:left="114" w:right="0" w:hanging="114"/>
+        <w:jc w:val="left"/>
+        <w:rPr>
+          <w:sz w:val="18"/>
+          <w:szCs w:val="18"/>
+        </w:rPr>
+      </w:pPr>
+      <w:r>
+        <w:rPr>
+          <w:rFonts w:ascii="Arial" w:hAnsi="Arial"/>
+          <w:sz w:val="18"/>
+        </w:rPr>
+        <w:t>Rebuilt a five-year-old Angular frontend into a modern UI based on Cloudflare's designs, with standardised patterns and strict adherence to frontend principles.</w:t>
+      </w:r>
+    </w:p>
+    <w:p>
+      <w:pPr>
+        <w:pStyle w:val="ListParagraph"/>
+        <w:numPr>
+          <w:ilvl w:val="0"/>
+          <w:numId w:val="1"/>
+        </w:numPr>
+        <w:tabs>
+          <w:tab w:val="left" w:leader="none" w:pos="114"/>
+        </w:tabs>
+        <w:spacing w:before="28" w:after="20" w:line="240" w:lineRule="auto"/>
+        <w:ind w:left="114" w:right="0" w:hanging="114"/>
+        <w:jc w:val="left"/>
+        <w:rPr>
+          <w:sz w:val="18"/>
+          <w:szCs w:val="18"/>
+        </w:rPr>
+      </w:pPr>
+      <w:r>
+        <w:rPr>
+          <w:rFonts w:ascii="Arial" w:hAnsi="Arial"/>
+          <w:sz w:val="18"/>
+        </w:rPr>
+        <w:t>Built an AI chat assistant on AWS Bedrock and wrote 250 pages of in-app documentation to triage customer-ops questions, with how-to guides and permissions and access guidance.</w:t>
+      </w:r>
+    </w:p>
+    <w:p>
+      <w:pPr>
+        <w:pStyle w:val="ListParagraph"/>
+        <w:numPr>
+          <w:ilvl w:val="0"/>
+          <w:numId w:val="1"/>
+        </w:numPr>
+        <w:tabs>
+          <w:tab w:val="left" w:leader="none" w:pos="114"/>
+        </w:tabs>
+        <w:spacing w:before="28" w:after="20" w:line="240" w:lineRule="auto"/>
+        <w:ind w:left="114" w:right="0" w:hanging="114"/>
+        <w:jc w:val="left"/>
+        <w:rPr>
+          <w:sz w:val="18"/>
+          <w:szCs w:val="18"/>
+        </w:rPr>
+      </w:pPr>
+      <w:r>
+        <w:rPr>
+          <w:rFonts w:ascii="Arial" w:hAnsi="Arial"/>
+          <w:sz w:val="18"/>
+        </w:rPr>
+        <w:t>Cut average API latency from 14s to 2s with Lambda warm-up pings and provisioned concurrency to remove cold starts (94% hit rate).</w:t>
       </w:r>
     </w:p>
     <w:p>

</xml_diff>

<commit_message>
feat(content): Arena AI chat used by 200 people, cuts onboarding and info requests
Co-Authored-By: Claude Opus 5.5 <noreply@anthropic.com>
</commit_message>
<xml_diff>
--- a/public/assets/abel_ghebrezadik_cv.docx
+++ b/public/assets/abel_ghebrezadik_cv.docx
@@ -340,7 +340,33 @@
           <w:rFonts w:ascii="Arial" w:hAnsi="Arial"/>
           <w:sz w:val="18"/>
         </w:rPr>
-        <w:t>Built an AI chat assistant on AWS Bedrock and wrote 250 pages of in-app documentation to triage customer-ops questions, with how-to guides and permissions and access guidance.</w:t>
+        <w:t>Built an AI conversational assistant on AWS Bedrock used by 200 people, cutting onboarding time and Slack and Jira requests for information.</w:t>
+      </w:r>
+    </w:p>
+    <w:p>
+      <w:pPr>
+        <w:pStyle w:val="ListParagraph"/>
+        <w:numPr>
+          <w:ilvl w:val="0"/>
+          <w:numId w:val="1"/>
+        </w:numPr>
+        <w:tabs>
+          <w:tab w:val="left" w:leader="none" w:pos="114"/>
+        </w:tabs>
+        <w:spacing w:before="28" w:after="20" w:line="240" w:lineRule="auto"/>
+        <w:ind w:left="114" w:right="0" w:hanging="114"/>
+        <w:jc w:val="left"/>
+        <w:rPr>
+          <w:sz w:val="18"/>
+          <w:szCs w:val="18"/>
+        </w:rPr>
+      </w:pPr>
+      <w:r>
+        <w:rPr>
+          <w:rFonts w:ascii="Arial" w:hAnsi="Arial"/>
+          <w:sz w:val="18"/>
+        </w:rPr>
+        <w:t>Wrote 250 pages of in-app documentation to triage customer-ops questions, with how-to guides and permissions and access guidance.</w:t>
       </w:r>
     </w:p>
     <w:p>

</xml_diff>

<commit_message>
feat(content): Arena AI chat usage and impact (#4)
AWS Bedrock AI conversational assistant used by 200 people; cuts onboarding time and Slack/Jira requests for information. Site and both CV files.

Co-Authored-By: Claude Opus 5.5 <noreply@anthropic.com>
</commit_message>
<xml_diff>
--- a/public/assets/abel_ghebrezadik_cv.docx
+++ b/public/assets/abel_ghebrezadik_cv.docx
@@ -340,7 +340,33 @@
           <w:rFonts w:ascii="Arial" w:hAnsi="Arial"/>
           <w:sz w:val="18"/>
         </w:rPr>
-        <w:t>Built an AI chat assistant on AWS Bedrock and wrote 250 pages of in-app documentation to triage customer-ops questions, with how-to guides and permissions and access guidance.</w:t>
+        <w:t>Built an AI conversational assistant on AWS Bedrock used by 200 people, cutting onboarding time and Slack and Jira requests for information.</w:t>
+      </w:r>
+    </w:p>
+    <w:p>
+      <w:pPr>
+        <w:pStyle w:val="ListParagraph"/>
+        <w:numPr>
+          <w:ilvl w:val="0"/>
+          <w:numId w:val="1"/>
+        </w:numPr>
+        <w:tabs>
+          <w:tab w:val="left" w:leader="none" w:pos="114"/>
+        </w:tabs>
+        <w:spacing w:before="28" w:after="20" w:line="240" w:lineRule="auto"/>
+        <w:ind w:left="114" w:right="0" w:hanging="114"/>
+        <w:jc w:val="left"/>
+        <w:rPr>
+          <w:sz w:val="18"/>
+          <w:szCs w:val="18"/>
+        </w:rPr>
+      </w:pPr>
+      <w:r>
+        <w:rPr>
+          <w:rFonts w:ascii="Arial" w:hAnsi="Arial"/>
+          <w:sz w:val="18"/>
+        </w:rPr>
+        <w:t>Wrote 250 pages of in-app documentation to triage customer-ops questions, with how-to guides and permissions and access guidance.</w:t>
       </w:r>
     </w:p>
     <w:p>

</xml_diff>

<commit_message>
feat(content): stop naming William Hill; file icons on the CV pills
Betmate's case study and the CV describe 'a leading sports betting company'
(the CV profile says 'via Betmate'); Client is Betmate. The PDF and Word
download pills carry Tabler file-type icons (MIT).

Co-Authored-By: Claude Opus 5.5 <noreply@anthropic.com>
</commit_message>
<xml_diff>
--- a/public/assets/abel_ghebrezadik_cv.docx
+++ b/public/assets/abel_ghebrezadik_cv.docx
@@ -101,7 +101,7 @@
       </w:pPr>
       <w:r>
         <w:rPr/>
-        <w:t>Lead / Senior Software Engineer with 10 years' experience building backend systems and products across finance, property, health and gambling. Specialist in C# and .NET on AWS serverless (Lambda, API Gateway, SNS/SQS), with TypeScript, React, Angular and Next.js on the front end, and AI features on AWS Bedrock. Led the backend of a £500k-jackpot multiplayer game inside the William Hill app that scaled to 1 million users, and was technical lead on a project that saved SalaryFinance millions in fines. Leads greenfield builds, clears legacy tech debt and mentors engineers, in permanent and contract roles. BSc Mathematics, University of Southampton.</w:t>
+        <w:t>Lead / Senior Software Engineer with 10 years' experience building backend systems and products across finance, property, health and gambling. Specialist in C# and .NET on AWS serverless (Lambda, API Gateway, SNS/SQS), with TypeScript, React, Angular and Next.js on the front end, and AI features on AWS Bedrock. Led the backend of a £500k-jackpot multiplayer game, via Betmate, that scaled to 1 million users, and was technical lead on a project that saved SalaryFinance millions in fines. Leads greenfield builds, clears legacy tech debt and mentors engineers, in permanent and contract roles. BSc Mathematics, University of Southampton.</w:t>
       </w:r>
     </w:p>
     <w:p>
@@ -577,7 +577,7 @@
           <w:rFonts w:ascii="Arial" w:hAnsi="Arial"/>
           <w:sz w:val="18"/>
         </w:rPr>
-        <w:t>Led the backend of Final One Standing, a multiplayer game inside the William Hill app with a £500k jackpot, scaled to 1 million users.</w:t>
+        <w:t>Led the backend of Final One Standing, a multiplayer game for a leading sports betting company with a £500k jackpot, scaled to 1 million users.</w:t>
       </w:r>
     </w:p>
     <w:p>

</xml_diff>

<commit_message>
feat(content): stop naming William Hill; file icons on CV pills (#6)
Co-Authored-By: Claude Opus 5.5 <noreply@anthropic.com>
</commit_message>
<xml_diff>
--- a/public/assets/abel_ghebrezadik_cv.docx
+++ b/public/assets/abel_ghebrezadik_cv.docx
@@ -101,7 +101,7 @@
       </w:pPr>
       <w:r>
         <w:rPr/>
-        <w:t>Lead / Senior Software Engineer with 10 years' experience building backend systems and products across finance, property, health and gambling. Specialist in C# and .NET on AWS serverless (Lambda, API Gateway, SNS/SQS), with TypeScript, React, Angular and Next.js on the front end, and AI features on AWS Bedrock. Led the backend of a £500k-jackpot multiplayer game inside the William Hill app that scaled to 1 million users, and was technical lead on a project that saved SalaryFinance millions in fines. Leads greenfield builds, clears legacy tech debt and mentors engineers, in permanent and contract roles. BSc Mathematics, University of Southampton.</w:t>
+        <w:t>Lead / Senior Software Engineer with 10 years' experience building backend systems and products across finance, property, health and gambling. Specialist in C# and .NET on AWS serverless (Lambda, API Gateway, SNS/SQS), with TypeScript, React, Angular and Next.js on the front end, and AI features on AWS Bedrock. Led the backend of a £500k-jackpot multiplayer game, via Betmate, that scaled to 1 million users, and was technical lead on a project that saved SalaryFinance millions in fines. Leads greenfield builds, clears legacy tech debt and mentors engineers, in permanent and contract roles. BSc Mathematics, University of Southampton.</w:t>
       </w:r>
     </w:p>
     <w:p>
@@ -577,7 +577,7 @@
           <w:rFonts w:ascii="Arial" w:hAnsi="Arial"/>
           <w:sz w:val="18"/>
         </w:rPr>
-        <w:t>Led the backend of Final One Standing, a multiplayer game inside the William Hill app with a £500k jackpot, scaled to 1 million users.</w:t>
+        <w:t>Led the backend of Final One Standing, a multiplayer game for a leading sports betting company with a £500k jackpot, scaled to 1 million users.</w:t>
       </w:r>
     </w:p>
     <w:p>

</xml_diff>

<commit_message>
feat(cv): Projects mirror the case studies; drop diasporadreams
cabeazy, whenwillyoumarry.com and GPFlow, each linking to its case study
on abelghebz.com with repo-verified stacks. Betmate stays under Experience.

Co-Authored-By: Claude Opus 5.5 <noreply@anthropic.com>
</commit_message>
<xml_diff>
--- a/public/assets/abel_ghebrezadik_cv.docx
+++ b/public/assets/abel_ghebrezadik_cv.docx
@@ -1418,7 +1418,8 @@
     <w:p>
       <w:pPr>
         <w:pStyle w:val="BodyText"/>
-        <w:spacing w:before="40" w:after="20"/>
+        <w:keepNext/>
+        <w:spacing w:before="80" w:after="20"/>
       </w:pPr>
       <w:r>
         <w:rPr>
@@ -1428,7 +1429,11 @@
       </w:r>
       <w:r>
         <w:rPr/>
-        <w:t xml:space="preserve">  |  Own product, Mar 2026 – Present  |  </w:t>
+        <w:t xml:space="preserve">  |  Own product, Mar 2026 – Present</w:t>
+      </w:r>
+      <w:r>
+        <w:rPr/>
+        <w:t xml:space="preserve">  |  </w:t>
       </w:r>
       <w:hyperlink r:id="rId15">
         <w:r>
@@ -1438,6 +1443,18 @@
           <w:t xml:space="preserve">cabeazy.com</w:t>
         </w:r>
       </w:hyperlink>
+      <w:r>
+        <w:rPr/>
+        <w:t xml:space="preserve">  |  </w:t>
+      </w:r>
+      <w:hyperlink r:id="rId16">
+        <w:r>
+          <w:rPr>
+            <w:color w:val="1F4E8C"/>
+          </w:rPr>
+          <w:t xml:space="preserve">Case study</w:t>
+        </w:r>
+      </w:hyperlink>
     </w:p>
     <w:p>
       <w:pPr>
@@ -1494,6 +1511,7 @@
     <w:p>
       <w:pPr>
         <w:pStyle w:val="BodyText"/>
+        <w:keepNext/>
         <w:spacing w:before="80" w:after="20"/>
       </w:pPr>
       <w:r>
@@ -1504,9 +1522,13 @@
       </w:r>
       <w:r>
         <w:rPr/>
-        <w:t xml:space="preserve">  |  Own product  |  </w:t>
-      </w:r>
-      <w:hyperlink r:id="rId16">
+        <w:t xml:space="preserve">  |  Own product</w:t>
+      </w:r>
+      <w:r>
+        <w:rPr/>
+        <w:t xml:space="preserve">  |  </w:t>
+      </w:r>
+      <w:hyperlink r:id="rId17">
         <w:r>
           <w:rPr>
             <w:color w:val="1F4E8C"/>
@@ -1514,54 +1536,16 @@
           <w:t xml:space="preserve">whenwillyoumarry.com</w:t>
         </w:r>
       </w:hyperlink>
-    </w:p>
-    <w:p>
-      <w:pPr>
-        <w:pStyle w:val="ListParagraph"/>
-        <w:numPr>
-          <w:ilvl w:val="0"/>
-          <w:numId w:val="1"/>
-        </w:numPr>
-        <w:tabs>
-          <w:tab w:val="left" w:leader="none" w:pos="114"/>
-        </w:tabs>
-        <w:spacing w:before="28" w:after="20" w:line="240" w:lineRule="auto"/>
-        <w:ind w:left="114" w:right="0" w:hanging="114"/>
-        <w:jc w:val="left"/>
-        <w:rPr>
-          <w:sz w:val="18"/>
-          <w:szCs w:val="18"/>
-        </w:rPr>
-      </w:pPr>
-      <w:r>
-        <w:rPr>
-          <w:rFonts w:ascii="Arial" w:hAnsi="Arial"/>
-          <w:sz w:val="18"/>
-        </w:rPr>
-        <w:t>Wedding website builder with templates, a live-preview editor, RSVPs, a drag-and-drop seating chart and email and SMS broadcasts. TypeScript, Next.js, PostgreSQL with Drizzle, Redis, Stripe, Cloudflare R2, on Railway.</w:t>
-      </w:r>
-    </w:p>
-    <w:p>
-      <w:pPr>
-        <w:pStyle w:val="BodyText"/>
-        <w:spacing w:before="80" w:after="20"/>
-      </w:pPr>
-      <w:r>
-        <w:rPr>
-          <w:b/>
-        </w:rPr>
-        <w:t>diasporadreams.co.uk</w:t>
-      </w:r>
-      <w:r>
-        <w:rPr/>
-        <w:t xml:space="preserve">  |  Own start-up  |  </w:t>
-      </w:r>
-      <w:hyperlink r:id="rId17">
+      <w:r>
+        <w:rPr/>
+        <w:t xml:space="preserve">  |  </w:t>
+      </w:r>
+      <w:hyperlink r:id="rId18">
         <w:r>
           <w:rPr>
             <w:color w:val="1F4E8C"/>
           </w:rPr>
-          <w:t xml:space="preserve">diasporadreams.co.uk</w:t>
+          <w:t xml:space="preserve">Case study</w:t>
         </w:r>
       </w:hyperlink>
     </w:p>
@@ -1588,7 +1572,62 @@
           <w:rFonts w:ascii="Arial" w:hAnsi="Arial"/>
           <w:sz w:val="18"/>
         </w:rPr>
-        <w:t>Art dealership website.</w:t>
+        <w:t>Wedding website builder with templates, a live-preview editor, RSVPs, a drag-and-drop seating chart and email and SMS broadcasts. TypeScript, Next.js, PostgreSQL with Drizzle, Redis, Stripe, Cloudflare R2, on Railway.</w:t>
+      </w:r>
+    </w:p>
+    <w:p>
+      <w:pPr>
+        <w:pStyle w:val="BodyText"/>
+        <w:keepNext/>
+        <w:spacing w:before="80" w:after="20"/>
+      </w:pPr>
+      <w:r>
+        <w:rPr>
+          <w:b/>
+        </w:rPr>
+        <w:t>GPFlow</w:t>
+      </w:r>
+      <w:r>
+        <w:rPr/>
+        <w:t xml:space="preserve">  |  NHS England</w:t>
+      </w:r>
+      <w:r>
+        <w:rPr/>
+        <w:t xml:space="preserve">  |  </w:t>
+      </w:r>
+      <w:hyperlink r:id="rId19">
+        <w:r>
+          <w:rPr>
+            <w:color w:val="1F4E8C"/>
+          </w:rPr>
+          <w:t xml:space="preserve">Case study</w:t>
+        </w:r>
+      </w:hyperlink>
+    </w:p>
+    <w:p>
+      <w:pPr>
+        <w:pStyle w:val="ListParagraph"/>
+        <w:numPr>
+          <w:ilvl w:val="0"/>
+          <w:numId w:val="1"/>
+        </w:numPr>
+        <w:tabs>
+          <w:tab w:val="left" w:leader="none" w:pos="114"/>
+        </w:tabs>
+        <w:spacing w:before="28" w:after="20" w:line="240" w:lineRule="auto"/>
+        <w:ind w:left="114" w:right="0" w:hanging="114"/>
+        <w:jc w:val="left"/>
+        <w:rPr>
+          <w:sz w:val="18"/>
+          <w:szCs w:val="18"/>
+        </w:rPr>
+      </w:pPr>
+      <w:r>
+        <w:rPr>
+          <w:rFonts w:ascii="Arial" w:hAnsi="Arial"/>
+          <w:sz w:val="18"/>
+        </w:rPr>
+        <w:t>Bulk Accurx template management for GP practices: one Next.js and Tailwind app shipped as an Electron desktop app and a web app, with Playwright driving Accurx, SQLite storage and MongoDB licence checks.</w:t>
       </w:r>
     </w:p>
     <w:p>

</xml_diff>

<commit_message>
feat(content): Arena keyset pagination and regression-test app details
Keyset pagination made tables with billions of records retrievable; the
automation app is a Playwright regression-test app that traces Bitbucket
PRs into test cases and integrates with Claude through Abel's MCP server.
Site Arena entry and both CV files.

Co-Authored-By: Claude Opus 5.5 <noreply@anthropic.com>
</commit_message>
<xml_diff>
--- a/public/assets/abel_ghebrezadik_cv.docx
+++ b/public/assets/abel_ghebrezadik_cv.docx
@@ -444,33 +444,33 @@
           <w:rFonts w:ascii="Arial" w:hAnsi="Arial"/>
           <w:sz w:val="18"/>
         </w:rPr>
-        <w:t>Added Redis batch pipelines and rebuilt data tables with keyset (cursor) pagination.</w:t>
-      </w:r>
-    </w:p>
-    <w:p>
-      <w:pPr>
-        <w:pStyle w:val="ListParagraph"/>
-        <w:numPr>
-          <w:ilvl w:val="0"/>
-          <w:numId w:val="1"/>
-        </w:numPr>
-        <w:tabs>
-          <w:tab w:val="left" w:leader="none" w:pos="114"/>
-        </w:tabs>
-        <w:spacing w:before="28" w:after="20" w:line="240" w:lineRule="auto"/>
-        <w:ind w:left="114" w:right="0" w:hanging="114"/>
-        <w:jc w:val="left"/>
-        <w:rPr>
-          <w:sz w:val="18"/>
-          <w:szCs w:val="18"/>
-        </w:rPr>
-      </w:pPr>
-      <w:r>
-        <w:rPr>
-          <w:rFonts w:ascii="Arial" w:hAnsi="Arial"/>
-          <w:sz w:val="18"/>
-        </w:rPr>
-        <w:t>Built an automation app that runs UI tests through Playwright, Bitbucket, GitHub and Jira MCPs.</w:t>
+        <w:t>Added Redis batch pipelines and rebuilt data tables with keyset (cursor) pagination, making tables with billions of records retrievable.</w:t>
+      </w:r>
+    </w:p>
+    <w:p>
+      <w:pPr>
+        <w:pStyle w:val="ListParagraph"/>
+        <w:numPr>
+          <w:ilvl w:val="0"/>
+          <w:numId w:val="1"/>
+        </w:numPr>
+        <w:tabs>
+          <w:tab w:val="left" w:leader="none" w:pos="114"/>
+        </w:tabs>
+        <w:spacing w:before="28" w:after="20" w:line="240" w:lineRule="auto"/>
+        <w:ind w:left="114" w:right="0" w:hanging="114"/>
+        <w:jc w:val="left"/>
+        <w:rPr>
+          <w:sz w:val="18"/>
+          <w:szCs w:val="18"/>
+        </w:rPr>
+      </w:pPr>
+      <w:r>
+        <w:rPr>
+          <w:rFonts w:ascii="Arial" w:hAnsi="Arial"/>
+          <w:sz w:val="18"/>
+        </w:rPr>
+        <w:t>Built a regression-test automation app that runs UI tests with Playwright, traces Bitbucket PRs to create test cases, and integrates with Claude through an MCP server I built.</w:t>
       </w:r>
     </w:p>
     <w:p>

</xml_diff>

<commit_message>
feat(cv): Projects mirror the case studies; Arena details (#9)
Co-Authored-By: Claude Opus 5.5 <noreply@anthropic.com>
</commit_message>
<xml_diff>
--- a/public/assets/abel_ghebrezadik_cv.docx
+++ b/public/assets/abel_ghebrezadik_cv.docx
@@ -444,33 +444,33 @@
           <w:rFonts w:ascii="Arial" w:hAnsi="Arial"/>
           <w:sz w:val="18"/>
         </w:rPr>
-        <w:t>Added Redis batch pipelines and rebuilt data tables with keyset (cursor) pagination.</w:t>
-      </w:r>
-    </w:p>
-    <w:p>
-      <w:pPr>
-        <w:pStyle w:val="ListParagraph"/>
-        <w:numPr>
-          <w:ilvl w:val="0"/>
-          <w:numId w:val="1"/>
-        </w:numPr>
-        <w:tabs>
-          <w:tab w:val="left" w:leader="none" w:pos="114"/>
-        </w:tabs>
-        <w:spacing w:before="28" w:after="20" w:line="240" w:lineRule="auto"/>
-        <w:ind w:left="114" w:right="0" w:hanging="114"/>
-        <w:jc w:val="left"/>
-        <w:rPr>
-          <w:sz w:val="18"/>
-          <w:szCs w:val="18"/>
-        </w:rPr>
-      </w:pPr>
-      <w:r>
-        <w:rPr>
-          <w:rFonts w:ascii="Arial" w:hAnsi="Arial"/>
-          <w:sz w:val="18"/>
-        </w:rPr>
-        <w:t>Built an automation app that runs UI tests through Playwright, Bitbucket, GitHub and Jira MCPs.</w:t>
+        <w:t>Added Redis batch pipelines and rebuilt data tables with keyset (cursor) pagination, making tables with billions of records retrievable.</w:t>
+      </w:r>
+    </w:p>
+    <w:p>
+      <w:pPr>
+        <w:pStyle w:val="ListParagraph"/>
+        <w:numPr>
+          <w:ilvl w:val="0"/>
+          <w:numId w:val="1"/>
+        </w:numPr>
+        <w:tabs>
+          <w:tab w:val="left" w:leader="none" w:pos="114"/>
+        </w:tabs>
+        <w:spacing w:before="28" w:after="20" w:line="240" w:lineRule="auto"/>
+        <w:ind w:left="114" w:right="0" w:hanging="114"/>
+        <w:jc w:val="left"/>
+        <w:rPr>
+          <w:sz w:val="18"/>
+          <w:szCs w:val="18"/>
+        </w:rPr>
+      </w:pPr>
+      <w:r>
+        <w:rPr>
+          <w:rFonts w:ascii="Arial" w:hAnsi="Arial"/>
+          <w:sz w:val="18"/>
+        </w:rPr>
+        <w:t>Built a regression-test automation app that runs UI tests with Playwright, traces Bitbucket PRs to create test cases, and integrates with Claude through an MCP server I built.</w:t>
       </w:r>
     </w:p>
     <w:p>
@@ -1418,7 +1418,8 @@
     <w:p>
       <w:pPr>
         <w:pStyle w:val="BodyText"/>
-        <w:spacing w:before="40" w:after="20"/>
+        <w:keepNext/>
+        <w:spacing w:before="80" w:after="20"/>
       </w:pPr>
       <w:r>
         <w:rPr>
@@ -1428,7 +1429,11 @@
       </w:r>
       <w:r>
         <w:rPr/>
-        <w:t xml:space="preserve">  |  Own product, Mar 2026 – Present  |  </w:t>
+        <w:t xml:space="preserve">  |  Own product, Mar 2026 – Present</w:t>
+      </w:r>
+      <w:r>
+        <w:rPr/>
+        <w:t xml:space="preserve">  |  </w:t>
       </w:r>
       <w:hyperlink r:id="rId15">
         <w:r>
@@ -1438,6 +1443,18 @@
           <w:t xml:space="preserve">cabeazy.com</w:t>
         </w:r>
       </w:hyperlink>
+      <w:r>
+        <w:rPr/>
+        <w:t xml:space="preserve">  |  </w:t>
+      </w:r>
+      <w:hyperlink r:id="rId16">
+        <w:r>
+          <w:rPr>
+            <w:color w:val="1F4E8C"/>
+          </w:rPr>
+          <w:t xml:space="preserve">Case study</w:t>
+        </w:r>
+      </w:hyperlink>
     </w:p>
     <w:p>
       <w:pPr>
@@ -1494,6 +1511,7 @@
     <w:p>
       <w:pPr>
         <w:pStyle w:val="BodyText"/>
+        <w:keepNext/>
         <w:spacing w:before="80" w:after="20"/>
       </w:pPr>
       <w:r>
@@ -1504,9 +1522,13 @@
       </w:r>
       <w:r>
         <w:rPr/>
-        <w:t xml:space="preserve">  |  Own product  |  </w:t>
-      </w:r>
-      <w:hyperlink r:id="rId16">
+        <w:t xml:space="preserve">  |  Own product</w:t>
+      </w:r>
+      <w:r>
+        <w:rPr/>
+        <w:t xml:space="preserve">  |  </w:t>
+      </w:r>
+      <w:hyperlink r:id="rId17">
         <w:r>
           <w:rPr>
             <w:color w:val="1F4E8C"/>
@@ -1514,54 +1536,16 @@
           <w:t xml:space="preserve">whenwillyoumarry.com</w:t>
         </w:r>
       </w:hyperlink>
-    </w:p>
-    <w:p>
-      <w:pPr>
-        <w:pStyle w:val="ListParagraph"/>
-        <w:numPr>
-          <w:ilvl w:val="0"/>
-          <w:numId w:val="1"/>
-        </w:numPr>
-        <w:tabs>
-          <w:tab w:val="left" w:leader="none" w:pos="114"/>
-        </w:tabs>
-        <w:spacing w:before="28" w:after="20" w:line="240" w:lineRule="auto"/>
-        <w:ind w:left="114" w:right="0" w:hanging="114"/>
-        <w:jc w:val="left"/>
-        <w:rPr>
-          <w:sz w:val="18"/>
-          <w:szCs w:val="18"/>
-        </w:rPr>
-      </w:pPr>
-      <w:r>
-        <w:rPr>
-          <w:rFonts w:ascii="Arial" w:hAnsi="Arial"/>
-          <w:sz w:val="18"/>
-        </w:rPr>
-        <w:t>Wedding website builder with templates, a live-preview editor, RSVPs, a drag-and-drop seating chart and email and SMS broadcasts. TypeScript, Next.js, PostgreSQL with Drizzle, Redis, Stripe, Cloudflare R2, on Railway.</w:t>
-      </w:r>
-    </w:p>
-    <w:p>
-      <w:pPr>
-        <w:pStyle w:val="BodyText"/>
-        <w:spacing w:before="80" w:after="20"/>
-      </w:pPr>
-      <w:r>
-        <w:rPr>
-          <w:b/>
-        </w:rPr>
-        <w:t>diasporadreams.co.uk</w:t>
-      </w:r>
-      <w:r>
-        <w:rPr/>
-        <w:t xml:space="preserve">  |  Own start-up  |  </w:t>
-      </w:r>
-      <w:hyperlink r:id="rId17">
+      <w:r>
+        <w:rPr/>
+        <w:t xml:space="preserve">  |  </w:t>
+      </w:r>
+      <w:hyperlink r:id="rId18">
         <w:r>
           <w:rPr>
             <w:color w:val="1F4E8C"/>
           </w:rPr>
-          <w:t xml:space="preserve">diasporadreams.co.uk</w:t>
+          <w:t xml:space="preserve">Case study</w:t>
         </w:r>
       </w:hyperlink>
     </w:p>
@@ -1588,7 +1572,62 @@
           <w:rFonts w:ascii="Arial" w:hAnsi="Arial"/>
           <w:sz w:val="18"/>
         </w:rPr>
-        <w:t>Art dealership website.</w:t>
+        <w:t>Wedding website builder with templates, a live-preview editor, RSVPs, a drag-and-drop seating chart and email and SMS broadcasts. TypeScript, Next.js, PostgreSQL with Drizzle, Redis, Stripe, Cloudflare R2, on Railway.</w:t>
+      </w:r>
+    </w:p>
+    <w:p>
+      <w:pPr>
+        <w:pStyle w:val="BodyText"/>
+        <w:keepNext/>
+        <w:spacing w:before="80" w:after="20"/>
+      </w:pPr>
+      <w:r>
+        <w:rPr>
+          <w:b/>
+        </w:rPr>
+        <w:t>GPFlow</w:t>
+      </w:r>
+      <w:r>
+        <w:rPr/>
+        <w:t xml:space="preserve">  |  NHS England</w:t>
+      </w:r>
+      <w:r>
+        <w:rPr/>
+        <w:t xml:space="preserve">  |  </w:t>
+      </w:r>
+      <w:hyperlink r:id="rId19">
+        <w:r>
+          <w:rPr>
+            <w:color w:val="1F4E8C"/>
+          </w:rPr>
+          <w:t xml:space="preserve">Case study</w:t>
+        </w:r>
+      </w:hyperlink>
+    </w:p>
+    <w:p>
+      <w:pPr>
+        <w:pStyle w:val="ListParagraph"/>
+        <w:numPr>
+          <w:ilvl w:val="0"/>
+          <w:numId w:val="1"/>
+        </w:numPr>
+        <w:tabs>
+          <w:tab w:val="left" w:leader="none" w:pos="114"/>
+        </w:tabs>
+        <w:spacing w:before="28" w:after="20" w:line="240" w:lineRule="auto"/>
+        <w:ind w:left="114" w:right="0" w:hanging="114"/>
+        <w:jc w:val="left"/>
+        <w:rPr>
+          <w:sz w:val="18"/>
+          <w:szCs w:val="18"/>
+        </w:rPr>
+      </w:pPr>
+      <w:r>
+        <w:rPr>
+          <w:rFonts w:ascii="Arial" w:hAnsi="Arial"/>
+          <w:sz w:val="18"/>
+        </w:rPr>
+        <w:t>Bulk Accurx template management for GP practices: one Next.js and Tailwind app shipped as an Electron desktop app and a web app, with Playwright driving Accurx, SQLite storage and MongoDB licence checks.</w:t>
       </w:r>
     </w:p>
     <w:p>

</xml_diff>

<commit_message>
feat(cv): Python in the headline, generalist profile, corrected stacks
Merges the useful edits from Abel's hand-edited CV into the generated one
and keeps the site content in step:

- Headline keyword line adds Python; profile says C#/.NET specialist and
  increasingly a technology generalist (Python on the backend, not the
  front end)
- Arena: latency bullet leads; admin platform rebuild is done; GraphQL,
  Node.js in tech
- SalaryFinance: TypeScript, Vue, Python, MySQL, MSSQL; FCA Consumer Duty;
  created the debt sale backend logic
- Swift (iOS) in skills; tutoring is university graduates; NHS removes one
  day of repetitive manual work; MediatR on Betmate

Co-Authored-By: Claude Opus 5.5 <noreply@anthropic.com>
</commit_message>
<xml_diff>
--- a/public/assets/abel_ghebrezadik_cv.docx
+++ b/public/assets/abel_ghebrezadik_cv.docx
@@ -27,7 +27,7 @@
           <w:b/>
           <w:sz w:val="22"/>
         </w:rPr>
-        <w:t>Lead / Senior Software Engineer  ·  C# / .NET  ·  AWS  ·  TypeScript  ·  React</w:t>
+        <w:t>Lead / Senior Software Engineer  ·  C# / .NET  ·  Python  ·  AWS  ·  TypeScript  ·  React</w:t>
       </w:r>
     </w:p>
     <w:p>
@@ -101,7 +101,7 @@
       </w:pPr>
       <w:r>
         <w:rPr/>
-        <w:t>Lead / Senior Software Engineer with 10 years' experience building backend systems and products across finance, property, health and gambling. Specialist in C# and .NET on AWS serverless (Lambda, API Gateway, SNS/SQS), with TypeScript, React, Angular and Next.js on the front end, and AI features on AWS Bedrock. Led the backend of a £500k-jackpot multiplayer game, via Betmate, that scaled to 1 million users, and was technical lead on a project that saved SalaryFinance millions in fines. Leads greenfield builds, clears legacy tech debt and mentors engineers, in permanent and contract roles. BSc Mathematics, University of Southampton.</w:t>
+        <w:t>Lead / Senior Software Engineer with 10 years' experience building full-stack systems and products across finance, property, health and gambling. Specialist in C# and .NET on AWS serverless (Lambda, API Gateway, SNS/SQS) and increasingly a technology generalist: Python and Go on the backend, TypeScript, React, Angular and Next.js on the front end, and AI features on AWS Bedrock. Led the backend of a £500k-jackpot multiplayer game, via Betmate, that scaled to 1 million users, and was technical lead on a project that saved SalaryFinance millions in fines. Leads greenfield builds, clears legacy tech debt and mentors engineers, in permanent and contract roles. BSc Mathematics, University of Southampton.</w:t>
       </w:r>
     </w:p>
     <w:p>
@@ -143,7 +143,7 @@
       </w:r>
       <w:r>
         <w:rPr/>
-        <w:t>.NET 8 / .NET 6 / .NET Framework, Node.js, REST APIs, gRPC, GraphQL, microservices, event-driven architecture, CQRS, DDD, Dapper</w:t>
+        <w:t>.NET 8 / .NET 6 / .NET Framework, Node.js, REST APIs, gRPC, GraphQL, microservices, distributed systems, event-driven architecture, CQRS, DDD, Dapper</w:t>
       </w:r>
     </w:p>
     <w:p>
@@ -159,7 +159,7 @@
       </w:r>
       <w:r>
         <w:rPr/>
-        <w:t>React, Angular, Next.js, Vue.js, Blazor, Tailwind CSS, React Native, Expo, Kotlin (Android), Flutter</w:t>
+        <w:t>React, Angular, Next.js, Vue.js, Blazor, Tailwind CSS, React Native, Expo, Kotlin (Android), Swift (iOS), Flutter</w:t>
       </w:r>
     </w:p>
     <w:p>
@@ -288,33 +288,59 @@
       </w:r>
       <w:r>
         <w:rPr/>
-        <w:t>C#, .NET, TypeScript, Angular, React, AWS Bedrock, AWS Lambda, Snowflake, MySQL, Redis, Kafka, gRPC</w:t>
-      </w:r>
-    </w:p>
-    <w:p>
-      <w:pPr>
-        <w:pStyle w:val="ListParagraph"/>
-        <w:numPr>
-          <w:ilvl w:val="0"/>
-          <w:numId w:val="1"/>
-        </w:numPr>
-        <w:tabs>
-          <w:tab w:val="left" w:leader="none" w:pos="114"/>
-        </w:tabs>
-        <w:spacing w:before="28" w:after="20" w:line="240" w:lineRule="auto"/>
-        <w:ind w:left="114" w:right="0" w:hanging="114"/>
-        <w:jc w:val="left"/>
-        <w:rPr>
-          <w:sz w:val="18"/>
-          <w:szCs w:val="18"/>
-        </w:rPr>
-      </w:pPr>
-      <w:r>
-        <w:rPr>
-          <w:rFonts w:ascii="Arial" w:hAnsi="Arial"/>
-          <w:sz w:val="18"/>
-        </w:rPr>
-        <w:t>Rebuilt a five-year-old Angular frontend into a modern UI based on Cloudflare's designs, with standardised patterns and strict adherence to frontend principles.</w:t>
+        <w:t>C#, .NET, Node.js, TypeScript, Angular, React, AWS Bedrock, AWS Lambda, Snowflake, MySQL, Redis, Kafka, gRPC, GraphQL</w:t>
+      </w:r>
+    </w:p>
+    <w:p>
+      <w:pPr>
+        <w:pStyle w:val="ListParagraph"/>
+        <w:numPr>
+          <w:ilvl w:val="0"/>
+          <w:numId w:val="1"/>
+        </w:numPr>
+        <w:tabs>
+          <w:tab w:val="left" w:leader="none" w:pos="114"/>
+        </w:tabs>
+        <w:spacing w:before="28" w:after="20" w:line="240" w:lineRule="auto"/>
+        <w:ind w:left="114" w:right="0" w:hanging="114"/>
+        <w:jc w:val="left"/>
+        <w:rPr>
+          <w:sz w:val="18"/>
+          <w:szCs w:val="18"/>
+        </w:rPr>
+      </w:pPr>
+      <w:r>
+        <w:rPr>
+          <w:rFonts w:ascii="Arial" w:hAnsi="Arial"/>
+          <w:sz w:val="18"/>
+        </w:rPr>
+        <w:t>Cut average API latency from 14s to 2s with Lambda warm-up pings and provisioned concurrency to remove cold starts (94% hit rate).</w:t>
+      </w:r>
+    </w:p>
+    <w:p>
+      <w:pPr>
+        <w:pStyle w:val="ListParagraph"/>
+        <w:numPr>
+          <w:ilvl w:val="0"/>
+          <w:numId w:val="1"/>
+        </w:numPr>
+        <w:tabs>
+          <w:tab w:val="left" w:leader="none" w:pos="114"/>
+        </w:tabs>
+        <w:spacing w:before="28" w:after="20" w:line="240" w:lineRule="auto"/>
+        <w:ind w:left="114" w:right="0" w:hanging="114"/>
+        <w:jc w:val="left"/>
+        <w:rPr>
+          <w:sz w:val="18"/>
+          <w:szCs w:val="18"/>
+        </w:rPr>
+      </w:pPr>
+      <w:r>
+        <w:rPr>
+          <w:rFonts w:ascii="Arial" w:hAnsi="Arial"/>
+          <w:sz w:val="18"/>
+        </w:rPr>
+        <w:t>Rebuilt a five-year-old Angular frontend into a modern UI based on Cloudflare's designs, improving page-load speed, with standardised patterns and strict adherence to frontend principles.</w:t>
       </w:r>
     </w:p>
     <w:p>
@@ -392,32 +418,6 @@
           <w:rFonts w:ascii="Arial" w:hAnsi="Arial"/>
           <w:sz w:val="18"/>
         </w:rPr>
-        <w:t>Cut average API latency from 14s to 2s with Lambda warm-up pings and provisioned concurrency to remove cold starts (94% hit rate).</w:t>
-      </w:r>
-    </w:p>
-    <w:p>
-      <w:pPr>
-        <w:pStyle w:val="ListParagraph"/>
-        <w:numPr>
-          <w:ilvl w:val="0"/>
-          <w:numId w:val="1"/>
-        </w:numPr>
-        <w:tabs>
-          <w:tab w:val="left" w:leader="none" w:pos="114"/>
-        </w:tabs>
-        <w:spacing w:before="28" w:after="20" w:line="240" w:lineRule="auto"/>
-        <w:ind w:left="114" w:right="0" w:hanging="114"/>
-        <w:jc w:val="left"/>
-        <w:rPr>
-          <w:sz w:val="18"/>
-          <w:szCs w:val="18"/>
-        </w:rPr>
-      </w:pPr>
-      <w:r>
-        <w:rPr>
-          <w:rFonts w:ascii="Arial" w:hAnsi="Arial"/>
-          <w:sz w:val="18"/>
-        </w:rPr>
         <w:t>Improved Snowflake and MySQL query processing by 50% and changed GET lookups from O(n) to O(1).</w:t>
       </w:r>
     </w:p>
@@ -496,7 +496,7 @@
           <w:rFonts w:ascii="Arial" w:hAnsi="Arial"/>
           <w:sz w:val="18"/>
         </w:rPr>
-        <w:t>Rebuilding the internal admin platform in C#/.NET and React with DDD, CQRS over Kafka and gRPC between services.</w:t>
+        <w:t>Rebuilt the internal admin platform in C#/.NET and React with DDD, CQRS over Kafka, gRPC between services and a GraphQL API, migrating the old system function by function with AI agents that planned the work into Linear tickets, built it and reviewed the pull requests.</w:t>
       </w:r>
     </w:p>
     <w:p>
@@ -551,7 +551,7 @@
       </w:r>
       <w:r>
         <w:rPr/>
-        <w:t>C#, AWS Lambda, API Gateway, SNS/SQS, CloudFormation, CockroachDB, Dapper</w:t>
+        <w:t>C#, AWS Lambda, MediatR, API Gateway, SNS/SQS, CloudFormation, CockroachDB, Dapper</w:t>
       </w:r>
     </w:p>
     <w:p>
@@ -758,7 +758,7 @@
           <w:rFonts w:ascii="Arial" w:hAnsi="Arial"/>
           <w:sz w:val="18"/>
         </w:rPr>
-        <w:t>Automated bulk creation and deletion of message templates in Accurx, a third-party application used by GPs nationwide, removing a significant amount of manual work.</w:t>
+        <w:t>Automated bulk creation and deletion of message templates in Accurx, a third-party application used by GPs nationwide, removing one day of repetitive manual work.</w:t>
       </w:r>
     </w:p>
     <w:p>
@@ -827,28 +827,45 @@
     </w:p>
     <w:p>
       <w:pPr>
-        <w:pStyle w:val="ListParagraph"/>
-        <w:numPr>
-          <w:ilvl w:val="0"/>
-          <w:numId w:val="1"/>
-        </w:numPr>
-        <w:tabs>
-          <w:tab w:val="left" w:leader="none" w:pos="114"/>
-        </w:tabs>
-        <w:spacing w:before="28" w:after="20" w:line="240" w:lineRule="auto"/>
-        <w:ind w:left="114" w:right="0" w:hanging="114"/>
-        <w:jc w:val="left"/>
-        <w:rPr>
-          <w:sz w:val="18"/>
-          <w:szCs w:val="18"/>
-        </w:rPr>
-      </w:pPr>
-      <w:r>
-        <w:rPr>
-          <w:rFonts w:ascii="Arial" w:hAnsi="Arial"/>
-          <w:sz w:val="18"/>
-        </w:rPr>
-        <w:t>Tutored a university undergraduate in algorithms in Python, preparing them for internship technical tests.</w:t>
+        <w:pStyle w:val="BodyText"/>
+        <w:keepNext/>
+        <w:spacing w:before="40" w:after="40"/>
+      </w:pPr>
+      <w:r>
+        <w:rPr>
+          <w:b/>
+        </w:rPr>
+        <w:t xml:space="preserve">Tech: </w:t>
+      </w:r>
+      <w:r>
+        <w:rPr/>
+        <w:t>Python</w:t>
+      </w:r>
+    </w:p>
+    <w:p>
+      <w:pPr>
+        <w:pStyle w:val="ListParagraph"/>
+        <w:numPr>
+          <w:ilvl w:val="0"/>
+          <w:numId w:val="1"/>
+        </w:numPr>
+        <w:tabs>
+          <w:tab w:val="left" w:leader="none" w:pos="114"/>
+        </w:tabs>
+        <w:spacing w:before="28" w:after="20" w:line="240" w:lineRule="auto"/>
+        <w:ind w:left="114" w:right="0" w:hanging="114"/>
+        <w:jc w:val="left"/>
+        <w:rPr>
+          <w:sz w:val="18"/>
+          <w:szCs w:val="18"/>
+        </w:rPr>
+      </w:pPr>
+      <w:r>
+        <w:rPr>
+          <w:rFonts w:ascii="Arial" w:hAnsi="Arial"/>
+          <w:sz w:val="18"/>
+        </w:rPr>
+        <w:t>Tutored university graduates in algorithms in Python, preparing them for internship technical tests.</w:t>
       </w:r>
     </w:p>
     <w:p>
@@ -993,7 +1010,7 @@
       </w:r>
       <w:r>
         <w:rPr/>
-        <w:t xml:space="preserve">  |  B2B and B2C loans and salary advance</w:t>
+        <w:t xml:space="preserve">  |  B2B and B2C loans and salary advance, FCA Consumer Duty compliance</w:t>
       </w:r>
     </w:p>
     <w:p>
@@ -1010,7 +1027,7 @@
       </w:r>
       <w:r>
         <w:rPr/>
-        <w:t>C#, .NET 6, microservices, React, MSSQL</w:t>
+        <w:t>C#, .NET 6, microservices, TypeScript, Vue, Python, MySQL, MSSQL</w:t>
       </w:r>
     </w:p>
     <w:p>
@@ -1140,7 +1157,7 @@
           <w:rFonts w:ascii="Arial" w:hAnsi="Arial"/>
           <w:sz w:val="18"/>
         </w:rPr>
-        <w:t>Worked on the debt sale implementation, wrote its documentation and presented the application to an external client.</w:t>
+        <w:t>Created the backend logic for the debt sale implementation, wrote its documentation and presented the application to an external client.</w:t>
       </w:r>
     </w:p>
     <w:p>
@@ -1505,7 +1522,7 @@
           <w:rFonts w:ascii="Arial" w:hAnsi="Arial"/>
           <w:sz w:val="18"/>
         </w:rPr>
-        <w:t>Go API on PostgreSQL, Redis and NATS with a contract-first OpenAPI /v2, Stripe payments, WebSockets and a retry-safe job queue; React Native passenger and driver apps, a native Kotlin Android app under way, and a Next.js site and operator portal.</w:t>
+        <w:t>Go API on PostgreSQL, Redis and NATS with a contract-first OpenAPI /v2, Stripe payments, WebSockets and a retry-safe job queue; React Native passenger and driver apps, a native Kotlin Android app under way and a Swift iOS app to follow, and a Next.js site and operator portal.</w:t>
       </w:r>
     </w:p>
     <w:p>

</xml_diff>

<commit_message>
fix(cv): GPFlow is used in North Central London, not nationwide
The CV, NHS entry, GPFlow case study and its SEO description implied
national use; only NCL GP practices use the tool.

Co-Authored-By: Claude Opus 5.5 <noreply@anthropic.com>
</commit_message>
<xml_diff>
--- a/public/assets/abel_ghebrezadik_cv.docx
+++ b/public/assets/abel_ghebrezadik_cv.docx
@@ -758,7 +758,7 @@
           <w:rFonts w:ascii="Arial" w:hAnsi="Arial"/>
           <w:sz w:val="18"/>
         </w:rPr>
-        <w:t>Automated bulk creation and deletion of message templates in Accurx, a third-party application used by GPs nationwide, cutting a template sweep from 4 hours of manual work to 4 minutes.</w:t>
+        <w:t>Automated bulk creation and deletion of message templates in Accurx, a third-party application, for GP practices in North Central London (NCL), cutting a template sweep from 4 hours of manual work to 4 minutes.</w:t>
       </w:r>
     </w:p>
     <w:p>
@@ -1644,7 +1644,7 @@
           <w:rFonts w:ascii="Arial" w:hAnsi="Arial"/>
           <w:sz w:val="18"/>
         </w:rPr>
-        <w:t>Bulk Accurx template management for GP practices: one Next.js and Tailwind app shipped as an Electron desktop app and a web app, with Playwright driving Accurx, SQLite storage and MongoDB licence checks.</w:t>
+        <w:t>Bulk Accurx template management for GP practices in North Central London: one Next.js and Tailwind app shipped as an Electron desktop app and a web app, with Playwright driving Accurx, SQLite storage and MongoDB licence checks.</w:t>
       </w:r>
     </w:p>
     <w:p>

</xml_diff>